<commit_message>
Add Executive Analytics & Provenance Certificate features with UI figures 7 & 8, updated Word report, and PDF
</commit_message>
<xml_diff>
--- a/Assignment5/Assignment_5_Report_Sameet_Pisal_202401120018.docx
+++ b/Assignment5/Assignment_5_Report_Sameet_Pisal_202401120018.docx
@@ -943,6 +943,124 @@
                 <w:color w:val="000000"/>
                 <w:sz w:val="17"/>
               </w:rPr>
+              <w:t>Executive Sales &amp; Revenue Analytics API</w:t>
+            </w:r>
+          </w:p>
+        </w:tc>
+        <w:tc>
+          <w:tcPr>
+            <w:tcW w:type="dxa" w:w="6480"/>
+            <w:shd w:fill="FFFFFF"/>
+            <w:tcMar>
+              <w:top w:w="50" w:type="dxa"/>
+              <w:bottom w:w="50" w:type="dxa"/>
+              <w:left w:w="70" w:type="dxa"/>
+              <w:right w:w="70" w:type="dxa"/>
+            </w:tcMar>
+            <w:tcBorders>
+              <w:top w:val="single" w:sz="4" w:space="0" w:color="CCCCCC"/>
+              <w:bottom w:val="single" w:sz="4" w:space="0" w:color="CCCCCC"/>
+              <w:left w:val="single" w:sz="4" w:space="0" w:color="CCCCCC"/>
+              <w:right w:val="single" w:sz="4" w:space="0" w:color="CCCCCC"/>
+            </w:tcBorders>
+          </w:tcPr>
+          <w:p>
+            <w:r>
+              <w:rPr>
+                <w:rFonts w:ascii="Times New Roman" w:hAnsi="Times New Roman"/>
+                <w:color w:val="000000"/>
+                <w:sz w:val="17"/>
+              </w:rPr>
+              <w:t>GET /api/orders/stats/summary: Aggregates total gross revenue, transaction counts, average order value, status distribution, and top acquired models via MongoDB aggregation pipeline</w:t>
+            </w:r>
+          </w:p>
+        </w:tc>
+      </w:tr>
+      <w:tr>
+        <w:tc>
+          <w:tcPr>
+            <w:tcW w:type="dxa" w:w="3600"/>
+            <w:shd w:fill="F8F9FA"/>
+            <w:tcMar>
+              <w:top w:w="50" w:type="dxa"/>
+              <w:bottom w:w="50" w:type="dxa"/>
+              <w:left w:w="70" w:type="dxa"/>
+              <w:right w:w="70" w:type="dxa"/>
+            </w:tcMar>
+            <w:tcBorders>
+              <w:top w:val="single" w:sz="4" w:space="0" w:color="CCCCCC"/>
+              <w:bottom w:val="single" w:sz="4" w:space="0" w:color="CCCCCC"/>
+              <w:left w:val="single" w:sz="4" w:space="0" w:color="CCCCCC"/>
+              <w:right w:val="single" w:sz="4" w:space="0" w:color="CCCCCC"/>
+            </w:tcBorders>
+          </w:tcPr>
+          <w:p>
+            <w:r>
+              <w:rPr>
+                <w:rFonts w:ascii="Times New Roman" w:hAnsi="Times New Roman"/>
+                <w:b/>
+                <w:color w:val="000000"/>
+                <w:sz w:val="17"/>
+              </w:rPr>
+              <w:t>Digital Certificate &amp; Provenance Tracking</w:t>
+            </w:r>
+          </w:p>
+        </w:tc>
+        <w:tc>
+          <w:tcPr>
+            <w:tcW w:type="dxa" w:w="6480"/>
+            <w:shd w:fill="F8F9FA"/>
+            <w:tcMar>
+              <w:top w:w="50" w:type="dxa"/>
+              <w:bottom w:w="50" w:type="dxa"/>
+              <w:left w:w="70" w:type="dxa"/>
+              <w:right w:w="70" w:type="dxa"/>
+            </w:tcMar>
+            <w:tcBorders>
+              <w:top w:val="single" w:sz="4" w:space="0" w:color="CCCCCC"/>
+              <w:bottom w:val="single" w:sz="4" w:space="0" w:color="CCCCCC"/>
+              <w:left w:val="single" w:sz="4" w:space="0" w:color="CCCCCC"/>
+              <w:right w:val="single" w:sz="4" w:space="0" w:color="CCCCCC"/>
+            </w:tcBorders>
+          </w:tcPr>
+          <w:p>
+            <w:r>
+              <w:rPr>
+                <w:rFonts w:ascii="Times New Roman" w:hAnsi="Times New Roman"/>
+                <w:color w:val="000000"/>
+                <w:sz w:val="17"/>
+              </w:rPr>
+              <w:t>Client-side provenance certification and 4-stage dispatch tracking timeline (Registered -&gt; Atelier Regulation -&gt; Armored Transit -&gt; Handover) synchronized with MongoDB order state</w:t>
+            </w:r>
+          </w:p>
+        </w:tc>
+      </w:tr>
+      <w:tr>
+        <w:tc>
+          <w:tcPr>
+            <w:tcW w:type="dxa" w:w="3600"/>
+            <w:shd w:fill="FFFFFF"/>
+            <w:tcMar>
+              <w:top w:w="50" w:type="dxa"/>
+              <w:bottom w:w="50" w:type="dxa"/>
+              <w:left w:w="70" w:type="dxa"/>
+              <w:right w:w="70" w:type="dxa"/>
+            </w:tcMar>
+            <w:tcBorders>
+              <w:top w:val="single" w:sz="4" w:space="0" w:color="CCCCCC"/>
+              <w:bottom w:val="single" w:sz="4" w:space="0" w:color="CCCCCC"/>
+              <w:left w:val="single" w:sz="4" w:space="0" w:color="CCCCCC"/>
+              <w:right w:val="single" w:sz="4" w:space="0" w:color="CCCCCC"/>
+            </w:tcBorders>
+          </w:tcPr>
+          <w:p>
+            <w:r>
+              <w:rPr>
+                <w:rFonts w:ascii="Times New Roman" w:hAnsi="Times New Roman"/>
+                <w:b/>
+                <w:color w:val="000000"/>
+                <w:sz w:val="17"/>
+              </w:rPr>
               <w:t>Client-Side E-Commerce UI Integration</w:t>
             </w:r>
           </w:p>
@@ -1215,6 +1333,10 @@
         <w:t>• UPDATE (PUT /api/orders/:id): Allows seamless customer shipping address updates and administrative status transitions (Confirmed -&gt; Processing -&gt; Delivered) via Order.findByIdAndUpdate() with runValidators: true. Returns HTTP 200.</w:t>
         <w:br/>
         <w:t>• DELETE (DELETE /api/orders/:id): Cancels and permanently removes an acquisition document from MongoDB Atlas using Order.findByIdAndDelete(). Confirms document existence before deletion and returns HTTP 200.</w:t>
+        <w:br/>
+        <w:t>• ANALYTICS (GET /api/orders/stats/summary): Aggregates total gross revenue, transaction counts, average order value (AOV), order fulfillment status distribution, and top acquired horological models directly from the MongoDB Atlas orders collection.</w:t>
+        <w:br/>
+        <w:t>• PROVENANCE &amp; DISPATCH TRACKING: Dynamically issues client-side cryptographic certificates of authenticity with order ledger hashes and tracks live fulfillment milestones across 4 distinct stages synchronized with database status.</w:t>
       </w:r>
     </w:p>
     <w:p>
@@ -1245,7 +1367,7 @@
           <w:color w:val="1E1E1E"/>
           <w:sz w:val="20"/>
         </w:rPr>
-        <w:t>The Node.js and MongoDB Atlas CRUD application was thoroughly tested across API clients, console runtimes, and the live web interface. The following figures document the live execution of all four CRUD operations against the MongoDB Atlas cluster:</w:t>
+        <w:t>The Node.js and MongoDB Atlas CRUD application was thoroughly tested across API clients, console runtimes, and the live web interface. The following figures document the live execution of all CRUD operations, diagnostic monitoring, executive analytics, and provenance tracking against the MongoDB Atlas cluster:</w:t>
       </w:r>
     </w:p>
     <w:p>
@@ -1357,7 +1479,7 @@
           <w:color w:val="000000"/>
           <w:sz w:val="18"/>
         </w:rPr>
-        <w:t>Figure 2: AUREUM luxury timepiece website served on http://localhost:5000/ featuring the new 'Orders Vault' navigation item and active badge indicator linked directly to real-time MongoDB Atlas order records.</w:t>
+        <w:t>Figure 2: AUREUM luxury timepiece website served on http://localhost:5000/ featuring the new 'Orders Vault' and 'Analytics' navigation items and active badge indicator linked directly to real-time MongoDB Atlas order records.</w:t>
       </w:r>
     </w:p>
     <w:p>
@@ -1469,7 +1591,7 @@
           <w:color w:val="000000"/>
           <w:sz w:val="18"/>
         </w:rPr>
-        <w:t>Figure 4: AUREUM Orders Vault Modal demonstrating the READ, UPDATE, and DELETE operations, showing live MongoDB Atlas order cards with active database cluster indicator, search filters, and actionable buttons ('Edit Address', 'Advance Status', 'Cancel / Delete').</w:t>
+        <w:t>Figure 4: AUREUM Orders Vault Modal demonstrating the READ, UPDATE, and DELETE operations, showing live MongoDB Atlas order cards with active database cluster indicator, search filters, and actionable buttons ('Certificate &amp; Tracking', 'Edit Address', 'Advance Status', 'Cancel / Delete').</w:t>
       </w:r>
     </w:p>
     <w:p>
@@ -1582,6 +1704,118 @@
           <w:sz w:val="18"/>
         </w:rPr>
         <w:t>Figure 6: Diagnostic REST API endpoint (GET /api/status) served by Node.js, confirming active MongoDB Atlas connection state (readyState: 1), database name (aureum_watch_db), host address, and student verification credentials.</w:t>
+      </w:r>
+    </w:p>
+    <w:p>
+      <w:pPr>
+        <w:keepNext/>
+        <w:spacing w:before="120" w:after="60"/>
+        <w:jc w:val="center"/>
+      </w:pPr>
+      <w:r>
+        <w:drawing>
+          <wp:inline xmlns:a="http://schemas.openxmlformats.org/drawingml/2006/main" xmlns:pic="http://schemas.openxmlformats.org/drawingml/2006/picture">
+            <wp:extent cx="5806440" cy="3830638"/>
+            <wp:docPr id="7" name="Picture 7"/>
+            <wp:cNvGraphicFramePr>
+              <a:graphicFrameLocks noChangeAspect="1"/>
+            </wp:cNvGraphicFramePr>
+            <a:graphic>
+              <a:graphicData uri="http://schemas.openxmlformats.org/drawingml/2006/picture">
+                <pic:pic>
+                  <pic:nvPicPr>
+                    <pic:cNvPr id="0" name="fig7_analytics_revenue_dashboard.png"/>
+                    <pic:cNvPicPr/>
+                  </pic:nvPicPr>
+                  <pic:blipFill>
+                    <a:blip r:embed="rId15"/>
+                    <a:stretch>
+                      <a:fillRect/>
+                    </a:stretch>
+                  </pic:blipFill>
+                  <pic:spPr>
+                    <a:xfrm>
+                      <a:off x="0" y="0"/>
+                      <a:ext cx="5806440" cy="3830638"/>
+                    </a:xfrm>
+                    <a:prstGeom prst="rect"/>
+                  </pic:spPr>
+                </pic:pic>
+              </a:graphicData>
+            </a:graphic>
+          </wp:inline>
+        </w:drawing>
+      </w:r>
+    </w:p>
+    <w:p>
+      <w:pPr>
+        <w:spacing w:before="20" w:after="160"/>
+        <w:jc w:val="center"/>
+      </w:pPr>
+      <w:r>
+        <w:rPr>
+          <w:rFonts w:ascii="Times New Roman" w:hAnsi="Times New Roman"/>
+          <w:i/>
+          <w:color w:val="000000"/>
+          <w:sz w:val="18"/>
+        </w:rPr>
+        <w:t>Figure 7: Executive Horology Analytics &amp; Revenue Insights Dashboard: Live demonstration of real-time sales aggregation querying GET /api/orders/stats/summary directly from MongoDB Atlas. Visualizes gross revenue (₹17,35,000), total acquisitions, average order value (₹8,67,500), shard latency (12ms), order status breakdown progress bars, top horological models, and cloud telemetry.</w:t>
+      </w:r>
+    </w:p>
+    <w:p>
+      <w:pPr>
+        <w:keepNext/>
+        <w:spacing w:before="120" w:after="60"/>
+        <w:jc w:val="center"/>
+      </w:pPr>
+      <w:r>
+        <w:drawing>
+          <wp:inline xmlns:a="http://schemas.openxmlformats.org/drawingml/2006/main" xmlns:pic="http://schemas.openxmlformats.org/drawingml/2006/picture">
+            <wp:extent cx="5806440" cy="3830638"/>
+            <wp:docPr id="8" name="Picture 8"/>
+            <wp:cNvGraphicFramePr>
+              <a:graphicFrameLocks noChangeAspect="1"/>
+            </wp:cNvGraphicFramePr>
+            <a:graphic>
+              <a:graphicData uri="http://schemas.openxmlformats.org/drawingml/2006/picture">
+                <pic:pic>
+                  <pic:nvPicPr>
+                    <pic:cNvPr id="0" name="fig8_certificate_dispatch_timeline.png"/>
+                    <pic:cNvPicPr/>
+                  </pic:nvPicPr>
+                  <pic:blipFill>
+                    <a:blip r:embed="rId16"/>
+                    <a:stretch>
+                      <a:fillRect/>
+                    </a:stretch>
+                  </pic:blipFill>
+                  <pic:spPr>
+                    <a:xfrm>
+                      <a:off x="0" y="0"/>
+                      <a:ext cx="5806440" cy="3830638"/>
+                    </a:xfrm>
+                    <a:prstGeom prst="rect"/>
+                  </pic:spPr>
+                </pic:pic>
+              </a:graphicData>
+            </a:graphic>
+          </wp:inline>
+        </w:drawing>
+      </w:r>
+    </w:p>
+    <w:p>
+      <w:pPr>
+        <w:spacing w:before="20" w:after="160"/>
+        <w:jc w:val="center"/>
+      </w:pPr>
+      <w:r>
+        <w:rPr>
+          <w:rFonts w:ascii="Times New Roman" w:hAnsi="Times New Roman"/>
+          <w:i/>
+          <w:color w:val="000000"/>
+          <w:sz w:val="18"/>
+        </w:rPr>
+        <w:t>Figure 8: Digital Certificate of Authenticity &amp; White-Glove Dispatch Timeline: Interactive luxury provenance certification modal linked to individual MongoDB order records. Displays cryptographic provenance registry ID (PROV-AUR-892144-DS), customer attribution (Sameet Pisal, PRN: 202401120018, Department of Data Science), database document ledger ID, calibre specifications, and an interactive 4-stage dispatch tracking timeline synchronized with the order lifecycle.</w:t>
       </w:r>
     </w:p>
     <w:p>

</xml_diff>